<commit_message>
Fix: Updated MTF Reseat.docx with dynamic tags and synced assets
</commit_message>
<xml_diff>
--- a/backend/src/assets/MTF Reseat.docx
+++ b/backend/src/assets/MTF Reseat.docx
@@ -58,7 +58,7 @@
     </w:p>
     <w:p>
       <w:r>
-        <w:t xml:space="preserve">CONTACT DETAIL -                                                                                           MEMBER DETAIL                                                                 </w:t>
+        <w:t xml:space="preserve">CONTACT DETAIL -                                                                                           MEMBER                                                           </w:t>
       </w:r>
     </w:p>
     <w:p>
@@ -71,37 +71,60 @@
             <w:color w:val="1155CC"/>
             <w:u w:val="single"/>
           </w:rPr>
-          <w:t>Info@m</w:t>
-        </w:r>
-        <w:r>
-          <w:rPr>
-            <w:color w:val="1155CC"/>
-            <w:u w:val="single"/>
-          </w:rPr>
-          <w:t>uscletime.co.in</w:t>
+          <w:t>Info@muscletime.co.in</w:t>
         </w:r>
       </w:hyperlink>
       <w:r>
-        <w:t xml:space="preserve">                          </w:t>
-      </w:r>
-      <w:bookmarkStart w:id="0" w:name="_GoBack"/>
-      <w:bookmarkEnd w:id="0"/>
-      <w:r>
-        <w:t xml:space="preserve">                                  Member ID -</w:t>
-      </w:r>
-      <w:r>
-        <w:t xml:space="preserve">                                                                                                                                                                    </w:t>
-      </w:r>
-      <w:r>
-        <w:t xml:space="preserve">                                      </w:t>
+        <w:t xml:space="preserve">        </w:t>
+      </w:r>
+      <w:r>
+        <w:t xml:space="preserve">                        Member ID - </w:t>
+      </w:r>
+      <w:r>
+        <w:rPr>
+          <w:rFonts w:ascii="Courier New" w:hAnsi="Courier New" w:cs="Courier New"/>
+          <w:color w:val="D7BA7D"/>
+          <w:sz w:val="19"/>
+          <w:szCs w:val="19"/>
+        </w:rPr>
+        <w:t>{</w:t>
+      </w:r>
+      <w:proofErr w:type="spellStart"/>
+      <w:r>
+        <w:rPr>
+          <w:rFonts w:ascii="Courier New" w:hAnsi="Courier New" w:cs="Courier New"/>
+          <w:color w:val="D7BA7D"/>
+          <w:sz w:val="19"/>
+          <w:szCs w:val="19"/>
+        </w:rPr>
+        <w:t>memberId</w:t>
+      </w:r>
+      <w:proofErr w:type="spellEnd"/>
+      <w:r>
+        <w:rPr>
+          <w:rFonts w:ascii="Courier New" w:hAnsi="Courier New" w:cs="Courier New"/>
+          <w:color w:val="D7BA7D"/>
+          <w:sz w:val="19"/>
+          <w:szCs w:val="19"/>
+        </w:rPr>
+        <w:t>}</w:t>
+      </w:r>
+      <w:r>
+        <w:t xml:space="preserve">                                                                                                                                                                                                         </w:t>
       </w:r>
     </w:p>
     <w:p>
       <w:r>
-        <w:t>Mobile Number -</w:t>
-      </w:r>
-      <w:r>
-        <w:t xml:space="preserve"> </w:t>
+        <w:t xml:space="preserve">Mobile Number - </w:t>
+      </w:r>
+      <w:r>
+        <w:rPr>
+          <w:rFonts w:ascii="Courier New" w:hAnsi="Courier New" w:cs="Courier New"/>
+          <w:color w:val="D7BA7D"/>
+          <w:sz w:val="19"/>
+          <w:szCs w:val="19"/>
+        </w:rPr>
+        <w:t>{mobile}</w:t>
       </w:r>
     </w:p>
     <w:p>
@@ -114,13 +137,10 @@
       </w:r>
       <w:proofErr w:type="spellEnd"/>
       <w:r>
-        <w:t xml:space="preserve"> Or Recept</w:t>
-      </w:r>
-      <w:r>
-        <w:t xml:space="preserve">ion                                           </w:t>
-      </w:r>
-      <w:r>
-        <w:tab/>
+        <w:t xml:space="preserve"> Or Reception            </w:t>
+      </w:r>
+      <w:r>
+        <w:t xml:space="preserve">                   </w:t>
       </w:r>
       <w:r>
         <w:rPr>
@@ -129,6 +149,35 @@
           <w:highlight w:val="white"/>
         </w:rPr>
         <w:t xml:space="preserve">Date of Invoice: </w:t>
+      </w:r>
+      <w:r>
+        <w:rPr>
+          <w:rFonts w:ascii="Courier New" w:hAnsi="Courier New" w:cs="Courier New"/>
+          <w:color w:val="D7BA7D"/>
+          <w:sz w:val="19"/>
+          <w:szCs w:val="19"/>
+        </w:rPr>
+        <w:t>{</w:t>
+      </w:r>
+      <w:proofErr w:type="spellStart"/>
+      <w:r>
+        <w:rPr>
+          <w:rFonts w:ascii="Courier New" w:hAnsi="Courier New" w:cs="Courier New"/>
+          <w:color w:val="D7BA7D"/>
+          <w:sz w:val="19"/>
+          <w:szCs w:val="19"/>
+        </w:rPr>
+        <w:t>dateOfInvoice</w:t>
+      </w:r>
+      <w:proofErr w:type="spellEnd"/>
+      <w:r>
+        <w:rPr>
+          <w:rFonts w:ascii="Courier New" w:hAnsi="Courier New" w:cs="Courier New"/>
+          <w:color w:val="D7BA7D"/>
+          <w:sz w:val="19"/>
+          <w:szCs w:val="19"/>
+        </w:rPr>
+        <w:t>}</w:t>
       </w:r>
       <w:r>
         <w:rPr>
@@ -165,12 +214,6 @@
         <w:tab/>
       </w:r>
       <w:r>
-        <w:tab/>
-      </w:r>
-      <w:r>
-        <w:tab/>
-      </w:r>
-      <w:r>
         <w:rPr>
           <w:sz w:val="20"/>
           <w:szCs w:val="20"/>
@@ -178,10 +221,105 @@
         </w:rPr>
         <w:t xml:space="preserve">Date, Time : </w:t>
       </w:r>
+      <w:r>
+        <w:rPr>
+          <w:rFonts w:ascii="Courier New" w:hAnsi="Courier New" w:cs="Courier New"/>
+          <w:color w:val="D7BA7D"/>
+          <w:sz w:val="19"/>
+          <w:szCs w:val="19"/>
+        </w:rPr>
+        <w:t>{</w:t>
+      </w:r>
+      <w:proofErr w:type="spellStart"/>
+      <w:r>
+        <w:rPr>
+          <w:rFonts w:ascii="Courier New" w:hAnsi="Courier New" w:cs="Courier New"/>
+          <w:color w:val="D7BA7D"/>
+          <w:sz w:val="19"/>
+          <w:szCs w:val="19"/>
+        </w:rPr>
+        <w:t>dateTime</w:t>
+      </w:r>
+      <w:proofErr w:type="spellEnd"/>
+      <w:r>
+        <w:rPr>
+          <w:rFonts w:ascii="Courier New" w:hAnsi="Courier New" w:cs="Courier New"/>
+          <w:color w:val="D7BA7D"/>
+          <w:sz w:val="19"/>
+          <w:szCs w:val="19"/>
+        </w:rPr>
+        <w:t>}</w:t>
+      </w:r>
     </w:p>
     <w:p>
       <w:pPr>
-        <w:ind w:left="6480" w:firstLine="720"/>
+        <w:ind w:left="5760"/>
+        <w:rPr>
+          <w:rFonts w:ascii="Courier New" w:hAnsi="Courier New" w:cs="Courier New"/>
+          <w:color w:val="D7BA7D"/>
+          <w:sz w:val="19"/>
+          <w:szCs w:val="19"/>
+        </w:rPr>
+      </w:pPr>
+      <w:r>
+        <w:rPr>
+          <w:sz w:val="20"/>
+          <w:szCs w:val="20"/>
+          <w:highlight w:val="white"/>
+        </w:rPr>
+        <w:t xml:space="preserve">Invoice </w:t>
+      </w:r>
+      <w:proofErr w:type="gramStart"/>
+      <w:r>
+        <w:rPr>
+          <w:sz w:val="20"/>
+          <w:szCs w:val="20"/>
+          <w:highlight w:val="white"/>
+        </w:rPr>
+        <w:t>Type :</w:t>
+      </w:r>
+      <w:proofErr w:type="gramEnd"/>
+      <w:r>
+        <w:rPr>
+          <w:sz w:val="20"/>
+          <w:szCs w:val="20"/>
+          <w:highlight w:val="white"/>
+        </w:rPr>
+        <w:t xml:space="preserve"> </w:t>
+      </w:r>
+      <w:r>
+        <w:rPr>
+          <w:rFonts w:ascii="Courier New" w:hAnsi="Courier New" w:cs="Courier New"/>
+          <w:color w:val="D7BA7D"/>
+          <w:sz w:val="19"/>
+          <w:szCs w:val="19"/>
+        </w:rPr>
+        <w:t>{</w:t>
+      </w:r>
+      <w:proofErr w:type="spellStart"/>
+      <w:r>
+        <w:rPr>
+          <w:rFonts w:ascii="Courier New" w:hAnsi="Courier New" w:cs="Courier New"/>
+          <w:color w:val="D7BA7D"/>
+          <w:sz w:val="19"/>
+          <w:szCs w:val="19"/>
+        </w:rPr>
+        <w:t>invoiceType</w:t>
+      </w:r>
+      <w:proofErr w:type="spellEnd"/>
+      <w:r>
+        <w:rPr>
+          <w:rFonts w:ascii="Courier New" w:hAnsi="Courier New" w:cs="Courier New"/>
+          <w:color w:val="D7BA7D"/>
+          <w:sz w:val="19"/>
+          <w:szCs w:val="19"/>
+        </w:rPr>
+        <w:t>}</w:t>
+      </w:r>
+    </w:p>
+    <w:p>
+      <w:pPr>
+        <w:ind w:left="5760"/>
         <w:rPr>
           <w:b/>
           <w:bCs/>
@@ -189,39 +327,12 @@
           <w:szCs w:val="20"/>
         </w:rPr>
       </w:pPr>
-      <w:r>
-        <w:rPr>
-          <w:sz w:val="20"/>
-          <w:szCs w:val="20"/>
-          <w:highlight w:val="white"/>
-        </w:rPr>
-        <w:t xml:space="preserve">Invoice </w:t>
-      </w:r>
-      <w:proofErr w:type="gramStart"/>
-      <w:r>
-        <w:rPr>
-          <w:sz w:val="20"/>
-          <w:szCs w:val="20"/>
-          <w:highlight w:val="white"/>
-        </w:rPr>
-        <w:t>Type :</w:t>
-      </w:r>
-      <w:proofErr w:type="gramEnd"/>
-      <w:r>
-        <w:rPr>
-          <w:sz w:val="20"/>
-          <w:szCs w:val="20"/>
-          <w:highlight w:val="white"/>
-        </w:rPr>
-        <w:t xml:space="preserve"> </w:t>
-      </w:r>
     </w:p>
-    <w:p/>
     <w:tbl>
       <w:tblPr>
         <w:tblStyle w:val="a"/>
+        <w:tblpPr w:leftFromText="180" w:rightFromText="180" w:vertAnchor="text" w:horzAnchor="margin" w:tblpXSpec="center" w:tblpY="21"/>
         <w:tblW w:w="10320" w:type="dxa"/>
-        <w:jc w:val="center"/>
         <w:tblInd w:w="0" w:type="dxa"/>
         <w:tblBorders>
           <w:top w:val="single" w:sz="8" w:space="0" w:color="000000"/>
@@ -241,7 +352,6 @@
       <w:tr>
         <w:trPr>
           <w:trHeight w:val="5375"/>
-          <w:jc w:val="center"/>
         </w:trPr>
         <w:tc>
           <w:tcPr>
@@ -411,6 +521,7 @@
                 </w:tcPr>
                 <w:p>
                   <w:pPr>
+                    <w:framePr w:hSpace="180" w:wrap="around" w:vAnchor="text" w:hAnchor="margin" w:xAlign="center" w:y="21"/>
                     <w:widowControl w:val="0"/>
                     <w:pBdr>
                       <w:top w:val="nil"/>
@@ -489,6 +600,7 @@
                 </w:tcPr>
                 <w:p>
                   <w:pPr>
+                    <w:framePr w:hSpace="180" w:wrap="around" w:vAnchor="text" w:hAnchor="margin" w:xAlign="center" w:y="21"/>
                     <w:widowControl w:val="0"/>
                     <w:pBdr>
                       <w:top w:val="nil"/>
@@ -506,7 +618,36 @@
                     <w:rPr>
                       <w:u w:val="single"/>
                     </w:rPr>
-                    <w:t>Start Date</w:t>
+                    <w:t xml:space="preserve">Start Date: </w:t>
+                  </w:r>
+                  <w:r>
+                    <w:rPr>
+                      <w:rFonts w:ascii="Courier New" w:hAnsi="Courier New" w:cs="Courier New"/>
+                      <w:color w:val="D7BA7D"/>
+                      <w:sz w:val="19"/>
+                      <w:szCs w:val="19"/>
+                    </w:rPr>
+                    <w:t>{</w:t>
+                  </w:r>
+                  <w:proofErr w:type="spellStart"/>
+                  <w:r>
+                    <w:rPr>
+                      <w:rFonts w:ascii="Courier New" w:hAnsi="Courier New" w:cs="Courier New"/>
+                      <w:color w:val="D7BA7D"/>
+                      <w:sz w:val="19"/>
+                      <w:szCs w:val="19"/>
+                    </w:rPr>
+                    <w:t>startDate</w:t>
+                  </w:r>
+                  <w:proofErr w:type="spellEnd"/>
+                  <w:r>
+                    <w:rPr>
+                      <w:rFonts w:ascii="Courier New" w:hAnsi="Courier New" w:cs="Courier New"/>
+                      <w:color w:val="D7BA7D"/>
+                      <w:sz w:val="19"/>
+                      <w:szCs w:val="19"/>
+                    </w:rPr>
+                    <w:t>}</w:t>
                   </w:r>
                 </w:p>
               </w:tc>
@@ -523,6 +664,7 @@
                 </w:tcPr>
                 <w:p>
                   <w:pPr>
+                    <w:framePr w:hSpace="180" w:wrap="around" w:vAnchor="text" w:hAnchor="margin" w:xAlign="center" w:y="21"/>
                     <w:widowControl w:val="0"/>
                     <w:pBdr>
                       <w:top w:val="nil"/>
@@ -544,6 +686,41 @@
                     <w:t>EndDate</w:t>
                   </w:r>
                   <w:proofErr w:type="spellEnd"/>
+                  <w:r>
+                    <w:rPr>
+                      <w:u w:val="single"/>
+                    </w:rPr>
+                    <w:t xml:space="preserve">: </w:t>
+                  </w:r>
+                  <w:r>
+                    <w:rPr>
+                      <w:rFonts w:ascii="Courier New" w:hAnsi="Courier New" w:cs="Courier New"/>
+                      <w:color w:val="D7BA7D"/>
+                      <w:sz w:val="19"/>
+                      <w:szCs w:val="19"/>
+                    </w:rPr>
+                    <w:t>{</w:t>
+                  </w:r>
+                  <w:proofErr w:type="spellStart"/>
+                  <w:r>
+                    <w:rPr>
+                      <w:rFonts w:ascii="Courier New" w:hAnsi="Courier New" w:cs="Courier New"/>
+                      <w:color w:val="D7BA7D"/>
+                      <w:sz w:val="19"/>
+                      <w:szCs w:val="19"/>
+                    </w:rPr>
+                    <w:t>endDate</w:t>
+                  </w:r>
+                  <w:proofErr w:type="spellEnd"/>
+                  <w:r>
+                    <w:rPr>
+                      <w:rFonts w:ascii="Courier New" w:hAnsi="Courier New" w:cs="Courier New"/>
+                      <w:color w:val="D7BA7D"/>
+                      <w:sz w:val="19"/>
+                      <w:szCs w:val="19"/>
+                    </w:rPr>
+                    <w:t>}</w:t>
+                  </w:r>
                 </w:p>
               </w:tc>
             </w:tr>
@@ -602,6 +779,7 @@
                 </w:tcPr>
                 <w:p>
                   <w:pPr>
+                    <w:framePr w:hSpace="180" w:wrap="around" w:vAnchor="text" w:hAnchor="margin" w:xAlign="center" w:y="21"/>
                     <w:widowControl w:val="0"/>
                     <w:spacing w:line="240" w:lineRule="auto"/>
                     <w:rPr>
@@ -612,7 +790,36 @@
                     <w:rPr>
                       <w:u w:val="single"/>
                     </w:rPr>
-                    <w:t>Package Price - 6000</w:t>
+                    <w:t xml:space="preserve">Package Price - </w:t>
+                  </w:r>
+                  <w:r>
+                    <w:rPr>
+                      <w:rFonts w:ascii="Courier New" w:hAnsi="Courier New" w:cs="Courier New"/>
+                      <w:color w:val="D7BA7D"/>
+                      <w:sz w:val="19"/>
+                      <w:szCs w:val="19"/>
+                    </w:rPr>
+                    <w:t>{</w:t>
+                  </w:r>
+                  <w:proofErr w:type="spellStart"/>
+                  <w:r>
+                    <w:rPr>
+                      <w:rFonts w:ascii="Courier New" w:hAnsi="Courier New" w:cs="Courier New"/>
+                      <w:color w:val="D7BA7D"/>
+                      <w:sz w:val="19"/>
+                      <w:szCs w:val="19"/>
+                    </w:rPr>
+                    <w:t>packagePrice</w:t>
+                  </w:r>
+                  <w:proofErr w:type="spellEnd"/>
+                  <w:r>
+                    <w:rPr>
+                      <w:rFonts w:ascii="Courier New" w:hAnsi="Courier New" w:cs="Courier New"/>
+                      <w:color w:val="D7BA7D"/>
+                      <w:sz w:val="19"/>
+                      <w:szCs w:val="19"/>
+                    </w:rPr>
+                    <w:t>}</w:t>
                   </w:r>
                 </w:p>
               </w:tc>
@@ -672,6 +879,7 @@
                 </w:tcPr>
                 <w:p>
                   <w:pPr>
+                    <w:framePr w:hSpace="180" w:wrap="around" w:vAnchor="text" w:hAnchor="margin" w:xAlign="center" w:y="21"/>
                     <w:widowControl w:val="0"/>
                     <w:pBdr>
                       <w:top w:val="nil"/>
@@ -690,6 +898,15 @@
                       <w:u w:val="single"/>
                     </w:rPr>
                     <w:t xml:space="preserve">Discount - </w:t>
+                  </w:r>
+                  <w:r>
+                    <w:rPr>
+                      <w:rFonts w:ascii="Courier New" w:hAnsi="Courier New" w:cs="Courier New"/>
+                      <w:color w:val="D7BA7D"/>
+                      <w:sz w:val="19"/>
+                      <w:szCs w:val="19"/>
+                    </w:rPr>
+                    <w:t>{discount}</w:t>
                   </w:r>
                 </w:p>
               </w:tc>
@@ -794,6 +1011,7 @@
                 </w:tcPr>
                 <w:p>
                   <w:pPr>
+                    <w:framePr w:hSpace="180" w:wrap="around" w:vAnchor="text" w:hAnchor="margin" w:xAlign="center" w:y="21"/>
                     <w:widowControl w:val="0"/>
                     <w:pBdr>
                       <w:top w:val="nil"/>
@@ -805,10 +1023,7 @@
                     <w:spacing w:line="240" w:lineRule="auto"/>
                   </w:pPr>
                   <w:r>
-                    <w:t xml:space="preserve">TOTAL PAYMENT -  </w:t>
-                  </w:r>
-                  <w:r>
-                    <w:t xml:space="preserve">                                                            </w:t>
+                    <w:t xml:space="preserve">TOTAL PAYMENT -                                                              </w:t>
                   </w:r>
                 </w:p>
               </w:tc>
@@ -830,6 +1045,7 @@
                 </w:tcPr>
                 <w:p>
                   <w:pPr>
+                    <w:framePr w:hSpace="180" w:wrap="around" w:vAnchor="text" w:hAnchor="margin" w:xAlign="center" w:y="21"/>
                     <w:widowControl w:val="0"/>
                     <w:pBdr>
                       <w:top w:val="nil"/>
@@ -843,12 +1059,41 @@
                   <w:r>
                     <w:t xml:space="preserve">Paid Price - </w:t>
                   </w:r>
+                  <w:r>
+                    <w:rPr>
+                      <w:rFonts w:ascii="Courier New" w:hAnsi="Courier New" w:cs="Courier New"/>
+                      <w:color w:val="D7BA7D"/>
+                      <w:sz w:val="19"/>
+                      <w:szCs w:val="19"/>
+                    </w:rPr>
+                    <w:t>{</w:t>
+                  </w:r>
+                  <w:proofErr w:type="spellStart"/>
+                  <w:r>
+                    <w:rPr>
+                      <w:rFonts w:ascii="Courier New" w:hAnsi="Courier New" w:cs="Courier New"/>
+                      <w:color w:val="D7BA7D"/>
+                      <w:sz w:val="19"/>
+                      <w:szCs w:val="19"/>
+                    </w:rPr>
+                    <w:t>paidPrice</w:t>
+                  </w:r>
+                  <w:proofErr w:type="spellEnd"/>
+                  <w:r>
+                    <w:rPr>
+                      <w:rFonts w:ascii="Courier New" w:hAnsi="Courier New" w:cs="Courier New"/>
+                      <w:color w:val="D7BA7D"/>
+                      <w:sz w:val="19"/>
+                      <w:szCs w:val="19"/>
+                    </w:rPr>
+                    <w:t>}</w:t>
+                  </w:r>
                 </w:p>
               </w:tc>
             </w:tr>
             <w:tr>
               <w:trPr>
-                <w:trHeight w:val="4548"/>
+                <w:trHeight w:val="3811"/>
                 <w:jc w:val="center"/>
               </w:trPr>
               <w:tc>
@@ -864,71 +1109,54 @@
                 </w:tcPr>
                 <w:p>
                   <w:pPr>
+                    <w:framePr w:hSpace="180" w:wrap="around" w:vAnchor="text" w:hAnchor="margin" w:xAlign="center" w:y="21"/>
                     <w:widowControl w:val="0"/>
                     <w:spacing w:line="240" w:lineRule="auto"/>
                   </w:pPr>
                   <w:r>
-                    <w:t xml:space="preserve">Balance Amount- </w:t>
+                    <w:t>Balance Amount</w:t>
+                  </w:r>
+                  <w:proofErr w:type="gramStart"/>
+                  <w:r>
+                    <w:t xml:space="preserve">- </w:t>
+                  </w:r>
+                  <w:r>
+                    <w:t xml:space="preserve"> </w:t>
+                  </w:r>
+                  <w:r>
+                    <w:rPr>
+                      <w:rFonts w:ascii="Courier New" w:hAnsi="Courier New" w:cs="Courier New"/>
+                      <w:color w:val="D7BA7D"/>
+                      <w:sz w:val="19"/>
+                      <w:szCs w:val="19"/>
+                    </w:rPr>
+                    <w:t>{</w:t>
+                  </w:r>
+                  <w:proofErr w:type="spellStart"/>
+                  <w:proofErr w:type="gramEnd"/>
+                  <w:r>
+                    <w:rPr>
+                      <w:rFonts w:ascii="Courier New" w:hAnsi="Courier New" w:cs="Courier New"/>
+                      <w:color w:val="D7BA7D"/>
+                      <w:sz w:val="19"/>
+                      <w:szCs w:val="19"/>
+                    </w:rPr>
+                    <w:t>balanceAmount</w:t>
+                  </w:r>
+                  <w:proofErr w:type="spellEnd"/>
+                  <w:r>
+                    <w:rPr>
+                      <w:rFonts w:ascii="Courier New" w:hAnsi="Courier New" w:cs="Courier New"/>
+                      <w:color w:val="D7BA7D"/>
+                      <w:sz w:val="19"/>
+                      <w:szCs w:val="19"/>
+                    </w:rPr>
+                    <w:t>}</w:t>
                   </w:r>
                 </w:p>
                 <w:p>
                   <w:pPr>
-                    <w:widowControl w:val="0"/>
-                    <w:spacing w:line="240" w:lineRule="auto"/>
-                  </w:pPr>
-                </w:p>
-                <w:tbl>
-                  <w:tblPr>
-                    <w:tblStyle w:val="a5"/>
-                    <w:tblW w:w="3345" w:type="dxa"/>
-                    <w:tblInd w:w="0" w:type="dxa"/>
-                    <w:tblBorders>
-                      <w:top w:val="single" w:sz="8" w:space="0" w:color="000000"/>
-                      <w:left w:val="single" w:sz="8" w:space="0" w:color="000000"/>
-                      <w:bottom w:val="single" w:sz="8" w:space="0" w:color="000000"/>
-                      <w:right w:val="single" w:sz="8" w:space="0" w:color="000000"/>
-                      <w:insideH w:val="single" w:sz="8" w:space="0" w:color="000000"/>
-                      <w:insideV w:val="single" w:sz="8" w:space="0" w:color="000000"/>
-                    </w:tblBorders>
-                    <w:tblLayout w:type="fixed"/>
-                    <w:tblLook w:val="0600" w:firstRow="0" w:lastRow="0" w:firstColumn="0" w:lastColumn="0" w:noHBand="1" w:noVBand="1"/>
-                  </w:tblPr>
-                  <w:tblGrid>
-                    <w:gridCol w:w="3345"/>
-                  </w:tblGrid>
-                  <w:tr>
-                    <w:tc>
-                      <w:tcPr>
-                        <w:tcW w:w="3345" w:type="dxa"/>
-                        <w:shd w:val="clear" w:color="auto" w:fill="auto"/>
-                        <w:tcMar>
-                          <w:top w:w="100" w:type="dxa"/>
-                          <w:left w:w="100" w:type="dxa"/>
-                          <w:bottom w:w="100" w:type="dxa"/>
-                          <w:right w:w="100" w:type="dxa"/>
-                        </w:tcMar>
-                      </w:tcPr>
-                      <w:p>
-                        <w:pPr>
-                          <w:widowControl w:val="0"/>
-                          <w:pBdr>
-                            <w:top w:val="nil"/>
-                            <w:left w:val="nil"/>
-                            <w:bottom w:val="nil"/>
-                            <w:right w:val="nil"/>
-                            <w:between w:val="nil"/>
-                          </w:pBdr>
-                          <w:spacing w:line="240" w:lineRule="auto"/>
-                        </w:pPr>
-                        <w:r>
-                          <w:t xml:space="preserve">Next Payment Date - </w:t>
-                        </w:r>
-                      </w:p>
-                    </w:tc>
-                  </w:tr>
-                </w:tbl>
-                <w:p>
-                  <w:pPr>
+                    <w:framePr w:hSpace="180" w:wrap="around" w:vAnchor="text" w:hAnchor="margin" w:xAlign="center" w:y="21"/>
                     <w:widowControl w:val="0"/>
                     <w:spacing w:line="240" w:lineRule="auto"/>
                   </w:pPr>
@@ -966,6 +1194,7 @@
                       </w:tcPr>
                       <w:p>
                         <w:pPr>
+                          <w:framePr w:hSpace="180" w:wrap="around" w:vAnchor="text" w:hAnchor="margin" w:xAlign="center" w:y="21"/>
                           <w:widowControl w:val="0"/>
                           <w:pBdr>
                             <w:top w:val="nil"/>
@@ -977,10 +1206,10 @@
                           <w:spacing w:line="240" w:lineRule="auto"/>
                         </w:pPr>
                         <w:r>
-                          <w:t xml:space="preserve">Personal Training Charges - </w:t>
+                          <w:t>Personal Training Char</w:t>
                         </w:r>
                         <w:r>
-                          <w:t xml:space="preserve">               Discount - </w:t>
+                          <w:t xml:space="preserve">ges -   </w:t>
                         </w:r>
                       </w:p>
                     </w:tc>
@@ -988,6 +1217,7 @@
                 </w:tbl>
                 <w:p>
                   <w:pPr>
+                    <w:framePr w:hSpace="180" w:wrap="around" w:vAnchor="text" w:hAnchor="margin" w:xAlign="center" w:y="21"/>
                     <w:widowControl w:val="0"/>
                     <w:spacing w:line="240" w:lineRule="auto"/>
                   </w:pPr>
@@ -1025,6 +1255,7 @@
                       </w:tcPr>
                       <w:p>
                         <w:pPr>
+                          <w:framePr w:hSpace="180" w:wrap="around" w:vAnchor="text" w:hAnchor="margin" w:xAlign="center" w:y="21"/>
                           <w:widowControl w:val="0"/>
                           <w:pBdr>
                             <w:top w:val="nil"/>
@@ -1036,10 +1267,76 @@
                           <w:spacing w:line="240" w:lineRule="auto"/>
                         </w:pPr>
                         <w:r>
-                          <w:t xml:space="preserve">Total PT Payment - </w:t>
+                          <w:t>Total PT Payment -</w:t>
                         </w:r>
                         <w:r>
-                          <w:t xml:space="preserve">       Start Date -          End Date</w:t>
+                          <w:br/>
+                          <w:t xml:space="preserve">Start Date - </w:t>
+                        </w:r>
+                        <w:r>
+                          <w:rPr>
+                            <w:rFonts w:ascii="Courier New" w:hAnsi="Courier New" w:cs="Courier New"/>
+                            <w:color w:val="D7BA7D"/>
+                            <w:sz w:val="19"/>
+                            <w:szCs w:val="19"/>
+                          </w:rPr>
+                          <w:t>{</w:t>
+                        </w:r>
+                        <w:proofErr w:type="spellStart"/>
+                        <w:r>
+                          <w:rPr>
+                            <w:rFonts w:ascii="Courier New" w:hAnsi="Courier New" w:cs="Courier New"/>
+                            <w:color w:val="D7BA7D"/>
+                            <w:sz w:val="19"/>
+                            <w:szCs w:val="19"/>
+                          </w:rPr>
+                          <w:t>startDate</w:t>
+                        </w:r>
+                        <w:proofErr w:type="spellEnd"/>
+                        <w:r>
+                          <w:rPr>
+                            <w:rFonts w:ascii="Courier New" w:hAnsi="Courier New" w:cs="Courier New"/>
+                            <w:color w:val="D7BA7D"/>
+                            <w:sz w:val="19"/>
+                            <w:szCs w:val="19"/>
+                          </w:rPr>
+                          <w:t>}</w:t>
+                        </w:r>
+                        <w:r>
+                          <w:t xml:space="preserve"> </w:t>
+                        </w:r>
+                        <w:r>
+                          <w:br/>
+                          <w:t>End Date:</w:t>
+                        </w:r>
+                        <w:r>
+                          <w:rPr>
+                            <w:rFonts w:ascii="Courier New" w:hAnsi="Courier New" w:cs="Courier New"/>
+                            <w:color w:val="D7BA7D"/>
+                            <w:sz w:val="19"/>
+                            <w:szCs w:val="19"/>
+                          </w:rPr>
+                          <w:t xml:space="preserve"> {</w:t>
+                        </w:r>
+                        <w:proofErr w:type="spellStart"/>
+                        <w:r>
+                          <w:rPr>
+                            <w:rFonts w:ascii="Courier New" w:hAnsi="Courier New" w:cs="Courier New"/>
+                            <w:color w:val="D7BA7D"/>
+                            <w:sz w:val="19"/>
+                            <w:szCs w:val="19"/>
+                          </w:rPr>
+                          <w:t>endDate</w:t>
+                        </w:r>
+                        <w:proofErr w:type="spellEnd"/>
+                        <w:r>
+                          <w:rPr>
+                            <w:rFonts w:ascii="Courier New" w:hAnsi="Courier New" w:cs="Courier New"/>
+                            <w:color w:val="D7BA7D"/>
+                            <w:sz w:val="19"/>
+                            <w:szCs w:val="19"/>
+                          </w:rPr>
+                          <w:t>}</w:t>
                         </w:r>
                       </w:p>
                     </w:tc>
@@ -1047,6 +1344,7 @@
                 </w:tbl>
                 <w:p>
                   <w:pPr>
+                    <w:framePr w:hSpace="180" w:wrap="around" w:vAnchor="text" w:hAnchor="margin" w:xAlign="center" w:y="21"/>
                     <w:widowControl w:val="0"/>
                     <w:spacing w:line="240" w:lineRule="auto"/>
                   </w:pPr>
@@ -1084,6 +1382,7 @@
                       </w:tcPr>
                       <w:p>
                         <w:pPr>
+                          <w:framePr w:hSpace="180" w:wrap="around" w:vAnchor="text" w:hAnchor="margin" w:xAlign="center" w:y="21"/>
                           <w:widowControl w:val="0"/>
                           <w:pBdr>
                             <w:top w:val="nil"/>
@@ -1098,14 +1397,58 @@
                           <w:t xml:space="preserve">Total Amount - </w:t>
                         </w:r>
                         <w:r>
-                          <w:t xml:space="preserve">                           Payment Mode - </w:t>
+                          <w:rPr>
+                            <w:rFonts w:ascii="Courier New" w:hAnsi="Courier New" w:cs="Courier New"/>
+                            <w:color w:val="D7BA7D"/>
+                            <w:sz w:val="19"/>
+                            <w:szCs w:val="19"/>
+                          </w:rPr>
+                          <w:t>{</w:t>
                         </w:r>
+                        <w:proofErr w:type="spellStart"/>
+                        <w:r>
+                          <w:rPr>
+                            <w:rFonts w:ascii="Courier New" w:hAnsi="Courier New" w:cs="Courier New"/>
+                            <w:color w:val="D7BA7D"/>
+                            <w:sz w:val="19"/>
+                            <w:szCs w:val="19"/>
+                          </w:rPr>
+                          <w:t>totalPayment</w:t>
+                        </w:r>
+                        <w:proofErr w:type="spellEnd"/>
+                        <w:r>
+                          <w:rPr>
+                            <w:rFonts w:ascii="Courier New" w:hAnsi="Courier New" w:cs="Courier New"/>
+                            <w:color w:val="D7BA7D"/>
+                            <w:sz w:val="19"/>
+                            <w:szCs w:val="19"/>
+                          </w:rPr>
+                          <w:t>}</w:t>
+                        </w:r>
+                        <w:r>
+                          <w:t xml:space="preserve"> </w:t>
+                        </w:r>
+                        <w:r>
+                          <w:t xml:space="preserve"> Payment Mode - </w:t>
+                        </w:r>
+                        <w:r>
+                          <w:rPr>
+                            <w:rFonts w:ascii="Courier New" w:hAnsi="Courier New" w:cs="Courier New"/>
+                            <w:color w:val="D7BA7D"/>
+                            <w:sz w:val="19"/>
+                            <w:szCs w:val="19"/>
+                          </w:rPr>
+                          <w:t>{paymentMode}</w:t>
+                        </w:r>
+                        <w:bookmarkStart w:id="0" w:name="_GoBack"/>
+                        <w:bookmarkEnd w:id="0"/>
                       </w:p>
                     </w:tc>
                   </w:tr>
                 </w:tbl>
                 <w:p>
                   <w:pPr>
+                    <w:framePr w:hSpace="180" w:wrap="around" w:vAnchor="text" w:hAnchor="margin" w:xAlign="center" w:y="21"/>
                     <w:widowControl w:val="0"/>
                     <w:spacing w:line="240" w:lineRule="auto"/>
                   </w:pPr>
@@ -1143,6 +1486,7 @@
                       </w:tcPr>
                       <w:p>
                         <w:pPr>
+                          <w:framePr w:hSpace="180" w:wrap="around" w:vAnchor="text" w:hAnchor="margin" w:xAlign="center" w:y="21"/>
                           <w:widowControl w:val="0"/>
                           <w:pBdr>
                             <w:top w:val="nil"/>
@@ -1154,7 +1498,39 @@
                           <w:spacing w:line="240" w:lineRule="auto"/>
                         </w:pPr>
                         <w:r>
-                          <w:t xml:space="preserve">Comment - </w:t>
+                          <w:t>Package Detail</w:t>
+                        </w:r>
+                        <w:r>
+                          <w:t xml:space="preserve"> - </w:t>
+                        </w:r>
+                        <w:r>
+                          <w:rPr>
+                            <w:rFonts w:ascii="Courier New" w:hAnsi="Courier New" w:cs="Courier New"/>
+                            <w:color w:val="D7BA7D"/>
+                            <w:sz w:val="19"/>
+                            <w:szCs w:val="19"/>
+                          </w:rPr>
+                          <w:t>{</w:t>
+                        </w:r>
+                        <w:proofErr w:type="spellStart"/>
+                        <w:r>
+                          <w:rPr>
+                            <w:rFonts w:ascii="Courier New" w:hAnsi="Courier New" w:cs="Courier New"/>
+                            <w:color w:val="D7BA7D"/>
+                            <w:sz w:val="19"/>
+                            <w:szCs w:val="19"/>
+                          </w:rPr>
+                          <w:t>packageDetail</w:t>
+                        </w:r>
+                        <w:proofErr w:type="spellEnd"/>
+                        <w:r>
+                          <w:rPr>
+                            <w:rFonts w:ascii="Courier New" w:hAnsi="Courier New" w:cs="Courier New"/>
+                            <w:color w:val="D7BA7D"/>
+                            <w:sz w:val="19"/>
+                            <w:szCs w:val="19"/>
+                          </w:rPr>
+                          <w:t>}</w:t>
                         </w:r>
                       </w:p>
                     </w:tc>
@@ -1162,12 +1538,7 @@
                 </w:tbl>
                 <w:p>
                   <w:pPr>
-                    <w:widowControl w:val="0"/>
-                    <w:spacing w:line="240" w:lineRule="auto"/>
-                  </w:pPr>
-                </w:p>
-                <w:p>
-                  <w:pPr>
+                    <w:framePr w:hSpace="180" w:wrap="around" w:vAnchor="text" w:hAnchor="margin" w:xAlign="center" w:y="21"/>
                     <w:widowControl w:val="0"/>
                     <w:spacing w:line="240" w:lineRule="auto"/>
                   </w:pPr>
@@ -1335,7 +1706,6 @@
                 <w:szCs w:val="17"/>
                 <w:highlight w:val="white"/>
               </w:rPr>
-              <w:lastRenderedPageBreak/>
               <w:t xml:space="preserve">7. Misconduct or unsafe </w:t>
             </w:r>
             <w:proofErr w:type="spellStart"/>
@@ -1386,6 +1756,7 @@
         </w:tc>
       </w:tr>
     </w:tbl>
+    <w:p/>
     <w:p/>
     <w:sectPr>
       <w:pgSz w:w="12240" w:h="15840"/>

</xml_diff>

<commit_message>
chore(backend): update receipt template with payment mode placeholder
</commit_message>
<xml_diff>
--- a/backend/src/assets/MTF Reseat.docx
+++ b/backend/src/assets/MTF Reseat.docx
@@ -6,13 +6,17 @@
     <w:p>
       <w:pPr>
         <w:jc w:val="center"/>
+        <w:rPr>
+          <w:color w:val="000000" w:themeColor="text1"/>
+        </w:rPr>
       </w:pPr>
       <w:r>
         <w:rPr>
           <w:noProof/>
+          <w:color w:val="000000" w:themeColor="text1"/>
         </w:rPr>
         <w:drawing>
-          <wp:inline distT="114300" distB="114300" distL="114300" distR="114300">
+          <wp:inline distT="114300" distB="114300" distL="114300" distR="114300" wp14:anchorId="18BB13E1" wp14:editId="5BF66206">
             <wp:extent cx="1157288" cy="1157288"/>
             <wp:effectExtent l="0" t="0" r="0" b="0"/>
             <wp:docPr id="1" name="image1.jpg"/>
@@ -51,39 +55,67 @@
     <w:p>
       <w:pPr>
         <w:jc w:val="center"/>
+        <w:rPr>
+          <w:color w:val="000000" w:themeColor="text1"/>
+        </w:rPr>
       </w:pPr>
       <w:r>
+        <w:rPr>
+          <w:color w:val="000000" w:themeColor="text1"/>
+        </w:rPr>
         <w:t xml:space="preserve">MUSCLE TIME FITNESS                                                                                                               HINJAWADI                                                                                                             </w:t>
       </w:r>
     </w:p>
     <w:p>
-      <w:r>
+      <w:pPr>
+        <w:rPr>
+          <w:color w:val="000000" w:themeColor="text1"/>
+        </w:rPr>
+      </w:pPr>
+      <w:r>
+        <w:rPr>
+          <w:color w:val="000000" w:themeColor="text1"/>
+        </w:rPr>
         <w:t xml:space="preserve">CONTACT DETAIL -                                                                                           MEMBER                                                           </w:t>
       </w:r>
     </w:p>
     <w:p>
-      <w:r>
+      <w:pPr>
+        <w:rPr>
+          <w:color w:val="000000" w:themeColor="text1"/>
+        </w:rPr>
+      </w:pPr>
+      <w:r>
+        <w:rPr>
+          <w:color w:val="000000" w:themeColor="text1"/>
+        </w:rPr>
         <w:t xml:space="preserve">Support Email - </w:t>
       </w:r>
       <w:hyperlink r:id="rId5">
         <w:r>
           <w:rPr>
-            <w:color w:val="1155CC"/>
+            <w:color w:val="000000" w:themeColor="text1"/>
             <w:u w:val="single"/>
           </w:rPr>
           <w:t>Info@muscletime.co.in</w:t>
         </w:r>
       </w:hyperlink>
       <w:r>
+        <w:rPr>
+          <w:color w:val="000000" w:themeColor="text1"/>
+        </w:rPr>
         <w:t xml:space="preserve">        </w:t>
       </w:r>
       <w:r>
+        <w:rPr>
+          <w:color w:val="000000" w:themeColor="text1"/>
+        </w:rPr>
         <w:t xml:space="preserve">                        Member ID - </w:t>
       </w:r>
       <w:r>
         <w:rPr>
           <w:rFonts w:ascii="Courier New" w:hAnsi="Courier New" w:cs="Courier New"/>
-          <w:color w:val="D7BA7D"/>
+          <w:color w:val="000000" w:themeColor="text1"/>
           <w:sz w:val="19"/>
           <w:szCs w:val="19"/>
         </w:rPr>
@@ -93,7 +125,7 @@
       <w:r>
         <w:rPr>
           <w:rFonts w:ascii="Courier New" w:hAnsi="Courier New" w:cs="Courier New"/>
-          <w:color w:val="D7BA7D"/>
+          <w:color w:val="000000" w:themeColor="text1"/>
           <w:sz w:val="19"/>
           <w:szCs w:val="19"/>
         </w:rPr>
@@ -103,24 +135,35 @@
       <w:r>
         <w:rPr>
           <w:rFonts w:ascii="Courier New" w:hAnsi="Courier New" w:cs="Courier New"/>
-          <w:color w:val="D7BA7D"/>
+          <w:color w:val="000000" w:themeColor="text1"/>
           <w:sz w:val="19"/>
           <w:szCs w:val="19"/>
         </w:rPr>
         <w:t>}</w:t>
       </w:r>
       <w:r>
+        <w:rPr>
+          <w:color w:val="000000" w:themeColor="text1"/>
+        </w:rPr>
         <w:t xml:space="preserve">                                                                                                                                                                                                         </w:t>
       </w:r>
     </w:p>
     <w:p>
-      <w:r>
+      <w:pPr>
+        <w:rPr>
+          <w:color w:val="000000" w:themeColor="text1"/>
+        </w:rPr>
+      </w:pPr>
+      <w:r>
+        <w:rPr>
+          <w:color w:val="000000" w:themeColor="text1"/>
+        </w:rPr>
         <w:t xml:space="preserve">Mobile Number - </w:t>
       </w:r>
       <w:r>
         <w:rPr>
           <w:rFonts w:ascii="Courier New" w:hAnsi="Courier New" w:cs="Courier New"/>
-          <w:color w:val="D7BA7D"/>
+          <w:color w:val="000000" w:themeColor="text1"/>
           <w:sz w:val="19"/>
           <w:szCs w:val="19"/>
         </w:rPr>
@@ -128,22 +171,40 @@
       </w:r>
     </w:p>
     <w:p>
-      <w:r>
+      <w:pPr>
+        <w:rPr>
+          <w:color w:val="000000" w:themeColor="text1"/>
+        </w:rPr>
+      </w:pPr>
+      <w:r>
+        <w:rPr>
+          <w:color w:val="000000" w:themeColor="text1"/>
+        </w:rPr>
         <w:t xml:space="preserve">Responsible Log - </w:t>
       </w:r>
       <w:proofErr w:type="spellStart"/>
       <w:r>
+        <w:rPr>
+          <w:color w:val="000000" w:themeColor="text1"/>
+        </w:rPr>
         <w:t>Vikram</w:t>
       </w:r>
       <w:proofErr w:type="spellEnd"/>
       <w:r>
+        <w:rPr>
+          <w:color w:val="000000" w:themeColor="text1"/>
+        </w:rPr>
         <w:t xml:space="preserve"> Or Reception            </w:t>
       </w:r>
       <w:r>
-        <w:t xml:space="preserve">                   </w:t>
-      </w:r>
-      <w:r>
-        <w:rPr>
+        <w:rPr>
+          <w:color w:val="000000" w:themeColor="text1"/>
+        </w:rPr>
+        <w:t xml:space="preserve">             </w:t>
+      </w:r>
+      <w:r>
+        <w:rPr>
+          <w:color w:val="000000" w:themeColor="text1"/>
           <w:sz w:val="20"/>
           <w:szCs w:val="20"/>
           <w:highlight w:val="white"/>
@@ -153,7 +214,7 @@
       <w:r>
         <w:rPr>
           <w:rFonts w:ascii="Courier New" w:hAnsi="Courier New" w:cs="Courier New"/>
-          <w:color w:val="D7BA7D"/>
+          <w:color w:val="000000" w:themeColor="text1"/>
           <w:sz w:val="19"/>
           <w:szCs w:val="19"/>
         </w:rPr>
@@ -163,7 +224,7 @@
       <w:r>
         <w:rPr>
           <w:rFonts w:ascii="Courier New" w:hAnsi="Courier New" w:cs="Courier New"/>
-          <w:color w:val="D7BA7D"/>
+          <w:color w:val="000000" w:themeColor="text1"/>
           <w:sz w:val="19"/>
           <w:szCs w:val="19"/>
         </w:rPr>
@@ -173,7 +234,7 @@
       <w:r>
         <w:rPr>
           <w:rFonts w:ascii="Courier New" w:hAnsi="Courier New" w:cs="Courier New"/>
-          <w:color w:val="D7BA7D"/>
+          <w:color w:val="000000" w:themeColor="text1"/>
           <w:sz w:val="19"/>
           <w:szCs w:val="19"/>
         </w:rPr>
@@ -183,6 +244,7 @@
         <w:rPr>
           <w:b/>
           <w:bCs/>
+          <w:color w:val="000000" w:themeColor="text1"/>
           <w:sz w:val="20"/>
           <w:szCs w:val="20"/>
           <w:highlight w:val="white"/>
@@ -190,31 +252,51 @@
         <w:br/>
       </w:r>
       <w:r>
+        <w:rPr>
+          <w:color w:val="000000" w:themeColor="text1"/>
+        </w:rPr>
         <w:tab/>
       </w:r>
       <w:r>
+        <w:rPr>
+          <w:color w:val="000000" w:themeColor="text1"/>
+        </w:rPr>
         <w:tab/>
       </w:r>
       <w:r>
+        <w:rPr>
+          <w:color w:val="000000" w:themeColor="text1"/>
+        </w:rPr>
         <w:tab/>
       </w:r>
       <w:r>
+        <w:rPr>
+          <w:color w:val="000000" w:themeColor="text1"/>
+        </w:rPr>
         <w:tab/>
       </w:r>
       <w:r>
+        <w:rPr>
+          <w:color w:val="000000" w:themeColor="text1"/>
+        </w:rPr>
         <w:tab/>
       </w:r>
       <w:r>
+        <w:rPr>
+          <w:color w:val="000000" w:themeColor="text1"/>
+        </w:rPr>
         <w:tab/>
       </w:r>
       <w:r>
+        <w:rPr>
+          <w:color w:val="000000" w:themeColor="text1"/>
+        </w:rPr>
         <w:tab/>
-      </w:r>
-      <w:r>
-        <w:tab/>
-      </w:r>
-      <w:r>
-        <w:rPr>
+        <w:t xml:space="preserve">      </w:t>
+      </w:r>
+      <w:r>
+        <w:rPr>
+          <w:color w:val="000000" w:themeColor="text1"/>
           <w:sz w:val="20"/>
           <w:szCs w:val="20"/>
           <w:highlight w:val="white"/>
@@ -224,7 +306,7 @@
       <w:r>
         <w:rPr>
           <w:rFonts w:ascii="Courier New" w:hAnsi="Courier New" w:cs="Courier New"/>
-          <w:color w:val="D7BA7D"/>
+          <w:color w:val="000000" w:themeColor="text1"/>
           <w:sz w:val="19"/>
           <w:szCs w:val="19"/>
         </w:rPr>
@@ -234,7 +316,7 @@
       <w:r>
         <w:rPr>
           <w:rFonts w:ascii="Courier New" w:hAnsi="Courier New" w:cs="Courier New"/>
-          <w:color w:val="D7BA7D"/>
+          <w:color w:val="000000" w:themeColor="text1"/>
           <w:sz w:val="19"/>
           <w:szCs w:val="19"/>
         </w:rPr>
@@ -244,7 +326,67 @@
       <w:r>
         <w:rPr>
           <w:rFonts w:ascii="Courier New" w:hAnsi="Courier New" w:cs="Courier New"/>
-          <w:color w:val="D7BA7D"/>
+          <w:color w:val="000000" w:themeColor="text1"/>
+          <w:sz w:val="19"/>
+          <w:szCs w:val="19"/>
+        </w:rPr>
+        <w:t>}</w:t>
+      </w:r>
+    </w:p>
+    <w:p>
+      <w:pPr>
+        <w:ind w:left="4320" w:firstLine="720"/>
+        <w:rPr>
+          <w:rFonts w:ascii="Courier New" w:hAnsi="Courier New" w:cs="Courier New"/>
+          <w:color w:val="000000" w:themeColor="text1"/>
+          <w:sz w:val="19"/>
+          <w:szCs w:val="19"/>
+        </w:rPr>
+      </w:pPr>
+      <w:r>
+        <w:rPr>
+          <w:color w:val="000000" w:themeColor="text1"/>
+          <w:sz w:val="20"/>
+          <w:szCs w:val="20"/>
+          <w:highlight w:val="white"/>
+        </w:rPr>
+        <w:t xml:space="preserve">       </w:t>
+      </w:r>
+      <w:bookmarkStart w:id="0" w:name="_GoBack"/>
+      <w:bookmarkEnd w:id="0"/>
+      <w:r>
+        <w:rPr>
+          <w:color w:val="000000" w:themeColor="text1"/>
+          <w:sz w:val="20"/>
+          <w:szCs w:val="20"/>
+          <w:highlight w:val="white"/>
+        </w:rPr>
+        <w:t xml:space="preserve">Invoice Type : </w:t>
+      </w:r>
+      <w:r>
+        <w:rPr>
+          <w:rFonts w:ascii="Courier New" w:hAnsi="Courier New" w:cs="Courier New"/>
+          <w:color w:val="000000" w:themeColor="text1"/>
+          <w:sz w:val="19"/>
+          <w:szCs w:val="19"/>
+        </w:rPr>
+        <w:t>{</w:t>
+      </w:r>
+      <w:proofErr w:type="spellStart"/>
+      <w:r>
+        <w:rPr>
+          <w:rFonts w:ascii="Courier New" w:hAnsi="Courier New" w:cs="Courier New"/>
+          <w:color w:val="000000" w:themeColor="text1"/>
+          <w:sz w:val="19"/>
+          <w:szCs w:val="19"/>
+        </w:rPr>
+        <w:t>invoiceType</w:t>
+      </w:r>
+      <w:proofErr w:type="spellEnd"/>
+      <w:r>
+        <w:rPr>
+          <w:rFonts w:ascii="Courier New" w:hAnsi="Courier New" w:cs="Courier New"/>
+          <w:color w:val="000000" w:themeColor="text1"/>
           <w:sz w:val="19"/>
           <w:szCs w:val="19"/>
         </w:rPr>
@@ -255,74 +397,9 @@
       <w:pPr>
         <w:ind w:left="5760"/>
         <w:rPr>
-          <w:rFonts w:ascii="Courier New" w:hAnsi="Courier New" w:cs="Courier New"/>
-          <w:color w:val="D7BA7D"/>
-          <w:sz w:val="19"/>
-          <w:szCs w:val="19"/>
-        </w:rPr>
-      </w:pPr>
-      <w:r>
-        <w:rPr>
-          <w:sz w:val="20"/>
-          <w:szCs w:val="20"/>
-          <w:highlight w:val="white"/>
-        </w:rPr>
-        <w:t xml:space="preserve">Invoice </w:t>
-      </w:r>
-      <w:proofErr w:type="gramStart"/>
-      <w:r>
-        <w:rPr>
-          <w:sz w:val="20"/>
-          <w:szCs w:val="20"/>
-          <w:highlight w:val="white"/>
-        </w:rPr>
-        <w:t>Type :</w:t>
-      </w:r>
-      <w:proofErr w:type="gramEnd"/>
-      <w:r>
-        <w:rPr>
-          <w:sz w:val="20"/>
-          <w:szCs w:val="20"/>
-          <w:highlight w:val="white"/>
-        </w:rPr>
-        <w:t xml:space="preserve"> </w:t>
-      </w:r>
-      <w:r>
-        <w:rPr>
-          <w:rFonts w:ascii="Courier New" w:hAnsi="Courier New" w:cs="Courier New"/>
-          <w:color w:val="D7BA7D"/>
-          <w:sz w:val="19"/>
-          <w:szCs w:val="19"/>
-        </w:rPr>
-        <w:t>{</w:t>
-      </w:r>
-      <w:proofErr w:type="spellStart"/>
-      <w:r>
-        <w:rPr>
-          <w:rFonts w:ascii="Courier New" w:hAnsi="Courier New" w:cs="Courier New"/>
-          <w:color w:val="D7BA7D"/>
-          <w:sz w:val="19"/>
-          <w:szCs w:val="19"/>
-        </w:rPr>
-        <w:t>invoiceType</w:t>
-      </w:r>
-      <w:proofErr w:type="spellEnd"/>
-      <w:r>
-        <w:rPr>
-          <w:rFonts w:ascii="Courier New" w:hAnsi="Courier New" w:cs="Courier New"/>
-          <w:color w:val="D7BA7D"/>
-          <w:sz w:val="19"/>
-          <w:szCs w:val="19"/>
-        </w:rPr>
-        <w:t>}</w:t>
-      </w:r>
-    </w:p>
-    <w:p>
-      <w:pPr>
-        <w:ind w:left="5760"/>
-        <w:rPr>
           <w:b/>
           <w:bCs/>
+          <w:color w:val="000000" w:themeColor="text1"/>
           <w:sz w:val="20"/>
           <w:szCs w:val="20"/>
         </w:rPr>
@@ -377,6 +454,7 @@
               <w:spacing w:line="240" w:lineRule="auto"/>
               <w:jc w:val="center"/>
               <w:rPr>
+                <w:color w:val="000000" w:themeColor="text1"/>
                 <w:sz w:val="28"/>
                 <w:szCs w:val="28"/>
                 <w:u w:val="single"/>
@@ -384,6 +462,7 @@
             </w:pPr>
             <w:r>
               <w:rPr>
+                <w:color w:val="000000" w:themeColor="text1"/>
                 <w:sz w:val="28"/>
                 <w:szCs w:val="28"/>
                 <w:u w:val="single"/>
@@ -404,6 +483,7 @@
               <w:spacing w:line="240" w:lineRule="auto"/>
               <w:jc w:val="center"/>
               <w:rPr>
+                <w:color w:val="000000" w:themeColor="text1"/>
                 <w:sz w:val="28"/>
                 <w:szCs w:val="28"/>
                 <w:u w:val="single"/>
@@ -421,143 +501,8 @@
                 <w:between w:val="nil"/>
               </w:pBdr>
               <w:spacing w:line="240" w:lineRule="auto"/>
-              <w:jc w:val="center"/>
-              <w:rPr>
-                <w:sz w:val="28"/>
-                <w:szCs w:val="28"/>
-                <w:u w:val="single"/>
-              </w:rPr>
-            </w:pPr>
-          </w:p>
-          <w:p>
-            <w:pPr>
-              <w:widowControl w:val="0"/>
-              <w:pBdr>
-                <w:top w:val="nil"/>
-                <w:left w:val="nil"/>
-                <w:bottom w:val="nil"/>
-                <w:right w:val="nil"/>
-                <w:between w:val="nil"/>
-              </w:pBdr>
-              <w:spacing w:line="240" w:lineRule="auto"/>
-              <w:jc w:val="center"/>
-              <w:rPr>
-                <w:sz w:val="28"/>
-                <w:szCs w:val="28"/>
-                <w:u w:val="single"/>
-              </w:rPr>
-            </w:pPr>
-          </w:p>
-          <w:p>
-            <w:pPr>
-              <w:widowControl w:val="0"/>
-              <w:pBdr>
-                <w:top w:val="nil"/>
-                <w:left w:val="nil"/>
-                <w:bottom w:val="nil"/>
-                <w:right w:val="nil"/>
-                <w:between w:val="nil"/>
-              </w:pBdr>
-              <w:spacing w:line="240" w:lineRule="auto"/>
-              <w:jc w:val="center"/>
-              <w:rPr>
-                <w:sz w:val="28"/>
-                <w:szCs w:val="28"/>
-                <w:u w:val="single"/>
-              </w:rPr>
-            </w:pPr>
-          </w:p>
-          <w:p>
-            <w:pPr>
-              <w:widowControl w:val="0"/>
-              <w:pBdr>
-                <w:top w:val="nil"/>
-                <w:left w:val="nil"/>
-                <w:bottom w:val="nil"/>
-                <w:right w:val="nil"/>
-                <w:between w:val="nil"/>
-              </w:pBdr>
-              <w:spacing w:line="240" w:lineRule="auto"/>
-              <w:jc w:val="center"/>
-              <w:rPr>
-                <w:u w:val="single"/>
-              </w:rPr>
-            </w:pPr>
-          </w:p>
-          <w:tbl>
-            <w:tblPr>
-              <w:tblStyle w:val="a0"/>
-              <w:tblW w:w="2935" w:type="dxa"/>
-              <w:jc w:val="center"/>
-              <w:tblInd w:w="0" w:type="dxa"/>
-              <w:tblBorders>
-                <w:top w:val="single" w:sz="8" w:space="0" w:color="000000"/>
-                <w:left w:val="single" w:sz="8" w:space="0" w:color="000000"/>
-                <w:bottom w:val="single" w:sz="8" w:space="0" w:color="000000"/>
-                <w:right w:val="single" w:sz="8" w:space="0" w:color="000000"/>
-                <w:insideH w:val="single" w:sz="8" w:space="0" w:color="000000"/>
-                <w:insideV w:val="single" w:sz="8" w:space="0" w:color="000000"/>
-              </w:tblBorders>
-              <w:tblLayout w:type="fixed"/>
-              <w:tblLook w:val="0600" w:firstRow="0" w:lastRow="0" w:firstColumn="0" w:lastColumn="0" w:noHBand="1" w:noVBand="1"/>
-            </w:tblPr>
-            <w:tblGrid>
-              <w:gridCol w:w="2935"/>
-            </w:tblGrid>
-            <w:tr>
-              <w:trPr>
-                <w:jc w:val="center"/>
-              </w:trPr>
-              <w:tc>
-                <w:tcPr>
-                  <w:tcW w:w="2935" w:type="dxa"/>
-                  <w:shd w:val="clear" w:color="auto" w:fill="auto"/>
-                  <w:tcMar>
-                    <w:top w:w="100" w:type="dxa"/>
-                    <w:left w:w="100" w:type="dxa"/>
-                    <w:bottom w:w="100" w:type="dxa"/>
-                    <w:right w:w="100" w:type="dxa"/>
-                  </w:tcMar>
-                </w:tcPr>
-                <w:p>
-                  <w:pPr>
-                    <w:framePr w:hSpace="180" w:wrap="around" w:vAnchor="text" w:hAnchor="margin" w:xAlign="center" w:y="21"/>
-                    <w:widowControl w:val="0"/>
-                    <w:pBdr>
-                      <w:top w:val="nil"/>
-                      <w:left w:val="nil"/>
-                      <w:bottom w:val="nil"/>
-                      <w:right w:val="nil"/>
-                      <w:between w:val="nil"/>
-                    </w:pBdr>
-                    <w:spacing w:line="240" w:lineRule="auto"/>
-                    <w:rPr>
-                      <w:u w:val="single"/>
-                    </w:rPr>
-                  </w:pPr>
-                  <w:r>
-                    <w:rPr>
-                      <w:u w:val="single"/>
-                    </w:rPr>
-                    <w:t>Package Detail - 3M</w:t>
-                  </w:r>
-                </w:p>
-              </w:tc>
-            </w:tr>
-          </w:tbl>
-          <w:p>
-            <w:pPr>
-              <w:widowControl w:val="0"/>
-              <w:pBdr>
-                <w:top w:val="nil"/>
-                <w:left w:val="nil"/>
-                <w:bottom w:val="nil"/>
-                <w:right w:val="nil"/>
-                <w:between w:val="nil"/>
-              </w:pBdr>
-              <w:spacing w:line="240" w:lineRule="auto"/>
-              <w:jc w:val="center"/>
-              <w:rPr>
+              <w:rPr>
+                <w:color w:val="000000" w:themeColor="text1"/>
                 <w:u w:val="single"/>
               </w:rPr>
             </w:pPr>
@@ -611,11 +556,13 @@
                     </w:pBdr>
                     <w:spacing w:line="240" w:lineRule="auto"/>
                     <w:rPr>
+                      <w:color w:val="000000" w:themeColor="text1"/>
                       <w:u w:val="single"/>
                     </w:rPr>
                   </w:pPr>
                   <w:r>
                     <w:rPr>
+                      <w:color w:val="000000" w:themeColor="text1"/>
                       <w:u w:val="single"/>
                     </w:rPr>
                     <w:t xml:space="preserve">Start Date: </w:t>
@@ -623,7 +570,7 @@
                   <w:r>
                     <w:rPr>
                       <w:rFonts w:ascii="Courier New" w:hAnsi="Courier New" w:cs="Courier New"/>
-                      <w:color w:val="D7BA7D"/>
+                      <w:color w:val="000000" w:themeColor="text1"/>
                       <w:sz w:val="19"/>
                       <w:szCs w:val="19"/>
                     </w:rPr>
@@ -633,7 +580,7 @@
                   <w:r>
                     <w:rPr>
                       <w:rFonts w:ascii="Courier New" w:hAnsi="Courier New" w:cs="Courier New"/>
-                      <w:color w:val="D7BA7D"/>
+                      <w:color w:val="000000" w:themeColor="text1"/>
                       <w:sz w:val="19"/>
                       <w:szCs w:val="19"/>
                     </w:rPr>
@@ -643,7 +590,7 @@
                   <w:r>
                     <w:rPr>
                       <w:rFonts w:ascii="Courier New" w:hAnsi="Courier New" w:cs="Courier New"/>
-                      <w:color w:val="D7BA7D"/>
+                      <w:color w:val="000000" w:themeColor="text1"/>
                       <w:sz w:val="19"/>
                       <w:szCs w:val="19"/>
                     </w:rPr>
@@ -675,12 +622,14 @@
                     </w:pBdr>
                     <w:spacing w:line="240" w:lineRule="auto"/>
                     <w:rPr>
+                      <w:color w:val="000000" w:themeColor="text1"/>
                       <w:u w:val="single"/>
                     </w:rPr>
                   </w:pPr>
                   <w:proofErr w:type="spellStart"/>
                   <w:r>
                     <w:rPr>
+                      <w:color w:val="000000" w:themeColor="text1"/>
                       <w:u w:val="single"/>
                     </w:rPr>
                     <w:t>EndDate</w:t>
@@ -688,6 +637,7 @@
                   <w:proofErr w:type="spellEnd"/>
                   <w:r>
                     <w:rPr>
+                      <w:color w:val="000000" w:themeColor="text1"/>
                       <w:u w:val="single"/>
                     </w:rPr>
                     <w:t xml:space="preserve">: </w:t>
@@ -695,7 +645,7 @@
                   <w:r>
                     <w:rPr>
                       <w:rFonts w:ascii="Courier New" w:hAnsi="Courier New" w:cs="Courier New"/>
-                      <w:color w:val="D7BA7D"/>
+                      <w:color w:val="000000" w:themeColor="text1"/>
                       <w:sz w:val="19"/>
                       <w:szCs w:val="19"/>
                     </w:rPr>
@@ -705,7 +655,7 @@
                   <w:r>
                     <w:rPr>
                       <w:rFonts w:ascii="Courier New" w:hAnsi="Courier New" w:cs="Courier New"/>
-                      <w:color w:val="D7BA7D"/>
+                      <w:color w:val="000000" w:themeColor="text1"/>
                       <w:sz w:val="19"/>
                       <w:szCs w:val="19"/>
                     </w:rPr>
@@ -715,7 +665,7 @@
                   <w:r>
                     <w:rPr>
                       <w:rFonts w:ascii="Courier New" w:hAnsi="Courier New" w:cs="Courier New"/>
-                      <w:color w:val="D7BA7D"/>
+                      <w:color w:val="000000" w:themeColor="text1"/>
                       <w:sz w:val="19"/>
                       <w:szCs w:val="19"/>
                     </w:rPr>
@@ -738,6 +688,7 @@
               <w:spacing w:line="240" w:lineRule="auto"/>
               <w:jc w:val="center"/>
               <w:rPr>
+                <w:color w:val="000000" w:themeColor="text1"/>
                 <w:u w:val="single"/>
               </w:rPr>
             </w:pPr>
@@ -783,11 +734,13 @@
                     <w:widowControl w:val="0"/>
                     <w:spacing w:line="240" w:lineRule="auto"/>
                     <w:rPr>
+                      <w:color w:val="000000" w:themeColor="text1"/>
                       <w:u w:val="single"/>
                     </w:rPr>
                   </w:pPr>
                   <w:r>
                     <w:rPr>
+                      <w:color w:val="000000" w:themeColor="text1"/>
                       <w:u w:val="single"/>
                     </w:rPr>
                     <w:t xml:space="preserve">Package Price - </w:t>
@@ -795,7 +748,7 @@
                   <w:r>
                     <w:rPr>
                       <w:rFonts w:ascii="Courier New" w:hAnsi="Courier New" w:cs="Courier New"/>
-                      <w:color w:val="D7BA7D"/>
+                      <w:color w:val="000000" w:themeColor="text1"/>
                       <w:sz w:val="19"/>
                       <w:szCs w:val="19"/>
                     </w:rPr>
@@ -805,7 +758,7 @@
                   <w:r>
                     <w:rPr>
                       <w:rFonts w:ascii="Courier New" w:hAnsi="Courier New" w:cs="Courier New"/>
-                      <w:color w:val="D7BA7D"/>
+                      <w:color w:val="000000" w:themeColor="text1"/>
                       <w:sz w:val="19"/>
                       <w:szCs w:val="19"/>
                     </w:rPr>
@@ -815,7 +768,7 @@
                   <w:r>
                     <w:rPr>
                       <w:rFonts w:ascii="Courier New" w:hAnsi="Courier New" w:cs="Courier New"/>
-                      <w:color w:val="D7BA7D"/>
+                      <w:color w:val="000000" w:themeColor="text1"/>
                       <w:sz w:val="19"/>
                       <w:szCs w:val="19"/>
                     </w:rPr>
@@ -838,6 +791,7 @@
               <w:spacing w:line="240" w:lineRule="auto"/>
               <w:jc w:val="center"/>
               <w:rPr>
+                <w:color w:val="000000" w:themeColor="text1"/>
                 <w:u w:val="single"/>
               </w:rPr>
             </w:pPr>
@@ -890,11 +844,13 @@
                     </w:pBdr>
                     <w:spacing w:line="240" w:lineRule="auto"/>
                     <w:rPr>
+                      <w:color w:val="000000" w:themeColor="text1"/>
                       <w:u w:val="single"/>
                     </w:rPr>
                   </w:pPr>
                   <w:r>
                     <w:rPr>
+                      <w:color w:val="000000" w:themeColor="text1"/>
                       <w:u w:val="single"/>
                     </w:rPr>
                     <w:t xml:space="preserve">Discount - </w:t>
@@ -902,7 +858,7 @@
                   <w:r>
                     <w:rPr>
                       <w:rFonts w:ascii="Courier New" w:hAnsi="Courier New" w:cs="Courier New"/>
-                      <w:color w:val="D7BA7D"/>
+                      <w:color w:val="000000" w:themeColor="text1"/>
                       <w:sz w:val="19"/>
                       <w:szCs w:val="19"/>
                     </w:rPr>
@@ -925,6 +881,7 @@
               <w:spacing w:line="240" w:lineRule="auto"/>
               <w:jc w:val="center"/>
               <w:rPr>
+                <w:color w:val="000000" w:themeColor="text1"/>
                 <w:u w:val="single"/>
               </w:rPr>
             </w:pPr>
@@ -942,6 +899,7 @@
               <w:spacing w:line="240" w:lineRule="auto"/>
               <w:jc w:val="center"/>
               <w:rPr>
+                <w:color w:val="000000" w:themeColor="text1"/>
                 <w:u w:val="single"/>
               </w:rPr>
             </w:pPr>
@@ -971,6 +929,9 @@
               <w:spacing w:line="240" w:lineRule="auto"/>
               <w:ind w:right="554"/>
               <w:jc w:val="center"/>
+              <w:rPr>
+                <w:color w:val="000000" w:themeColor="text1"/>
+              </w:rPr>
             </w:pPr>
           </w:p>
           <w:tbl>
@@ -1021,8 +982,14 @@
                       <w:between w:val="nil"/>
                     </w:pBdr>
                     <w:spacing w:line="240" w:lineRule="auto"/>
+                    <w:rPr>
+                      <w:color w:val="000000" w:themeColor="text1"/>
+                    </w:rPr>
                   </w:pPr>
                   <w:r>
+                    <w:rPr>
+                      <w:color w:val="000000" w:themeColor="text1"/>
+                    </w:rPr>
                     <w:t xml:space="preserve">TOTAL PAYMENT -                                                              </w:t>
                   </w:r>
                 </w:p>
@@ -1055,14 +1022,20 @@
                       <w:between w:val="nil"/>
                     </w:pBdr>
                     <w:spacing w:line="240" w:lineRule="auto"/>
+                    <w:rPr>
+                      <w:color w:val="000000" w:themeColor="text1"/>
+                    </w:rPr>
                   </w:pPr>
                   <w:r>
+                    <w:rPr>
+                      <w:color w:val="000000" w:themeColor="text1"/>
+                    </w:rPr>
                     <w:t xml:space="preserve">Paid Price - </w:t>
                   </w:r>
                   <w:r>
                     <w:rPr>
                       <w:rFonts w:ascii="Courier New" w:hAnsi="Courier New" w:cs="Courier New"/>
-                      <w:color w:val="D7BA7D"/>
+                      <w:color w:val="000000" w:themeColor="text1"/>
                       <w:sz w:val="19"/>
                       <w:szCs w:val="19"/>
                     </w:rPr>
@@ -1072,7 +1045,7 @@
                   <w:r>
                     <w:rPr>
                       <w:rFonts w:ascii="Courier New" w:hAnsi="Courier New" w:cs="Courier New"/>
-                      <w:color w:val="D7BA7D"/>
+                      <w:color w:val="000000" w:themeColor="text1"/>
                       <w:sz w:val="19"/>
                       <w:szCs w:val="19"/>
                     </w:rPr>
@@ -1082,7 +1055,7 @@
                   <w:r>
                     <w:rPr>
                       <w:rFonts w:ascii="Courier New" w:hAnsi="Courier New" w:cs="Courier New"/>
-                      <w:color w:val="D7BA7D"/>
+                      <w:color w:val="000000" w:themeColor="text1"/>
                       <w:sz w:val="19"/>
                       <w:szCs w:val="19"/>
                     </w:rPr>
@@ -1112,21 +1085,41 @@
                     <w:framePr w:hSpace="180" w:wrap="around" w:vAnchor="text" w:hAnchor="margin" w:xAlign="center" w:y="21"/>
                     <w:widowControl w:val="0"/>
                     <w:spacing w:line="240" w:lineRule="auto"/>
+                    <w:rPr>
+                      <w:color w:val="000000" w:themeColor="text1"/>
+                    </w:rPr>
                   </w:pPr>
                   <w:r>
-                    <w:t>Balance Amount</w:t>
+                    <w:rPr>
+                      <w:color w:val="000000" w:themeColor="text1"/>
+                    </w:rPr>
+                    <w:t xml:space="preserve">Balance </w:t>
                   </w:r>
+                  <w:proofErr w:type="spellStart"/>
+                  <w:r>
+                    <w:rPr>
+                      <w:color w:val="000000" w:themeColor="text1"/>
+                    </w:rPr>
+                    <w:t>Reamining</w:t>
+                  </w:r>
+                  <w:proofErr w:type="spellEnd"/>
                   <w:proofErr w:type="gramStart"/>
                   <w:r>
+                    <w:rPr>
+                      <w:color w:val="000000" w:themeColor="text1"/>
+                    </w:rPr>
                     <w:t xml:space="preserve">- </w:t>
                   </w:r>
                   <w:r>
+                    <w:rPr>
+                      <w:color w:val="000000" w:themeColor="text1"/>
+                    </w:rPr>
                     <w:t xml:space="preserve"> </w:t>
                   </w:r>
                   <w:r>
                     <w:rPr>
                       <w:rFonts w:ascii="Courier New" w:hAnsi="Courier New" w:cs="Courier New"/>
-                      <w:color w:val="D7BA7D"/>
+                      <w:color w:val="000000" w:themeColor="text1"/>
                       <w:sz w:val="19"/>
                       <w:szCs w:val="19"/>
                     </w:rPr>
@@ -1137,7 +1130,7 @@
                   <w:r>
                     <w:rPr>
                       <w:rFonts w:ascii="Courier New" w:hAnsi="Courier New" w:cs="Courier New"/>
-                      <w:color w:val="D7BA7D"/>
+                      <w:color w:val="000000" w:themeColor="text1"/>
                       <w:sz w:val="19"/>
                       <w:szCs w:val="19"/>
                     </w:rPr>
@@ -1147,7 +1140,7 @@
                   <w:r>
                     <w:rPr>
                       <w:rFonts w:ascii="Courier New" w:hAnsi="Courier New" w:cs="Courier New"/>
-                      <w:color w:val="D7BA7D"/>
+                      <w:color w:val="000000" w:themeColor="text1"/>
                       <w:sz w:val="19"/>
                       <w:szCs w:val="19"/>
                     </w:rPr>
@@ -1159,194 +1152,19 @@
                     <w:framePr w:hSpace="180" w:wrap="around" w:vAnchor="text" w:hAnchor="margin" w:xAlign="center" w:y="21"/>
                     <w:widowControl w:val="0"/>
                     <w:spacing w:line="240" w:lineRule="auto"/>
+                    <w:rPr>
+                      <w:color w:val="000000" w:themeColor="text1"/>
+                    </w:rPr>
                   </w:pPr>
                 </w:p>
-                <w:tbl>
-                  <w:tblPr>
-                    <w:tblStyle w:val="a6"/>
-                    <w:tblW w:w="6505" w:type="dxa"/>
-                    <w:tblInd w:w="0" w:type="dxa"/>
-                    <w:tblBorders>
-                      <w:top w:val="single" w:sz="8" w:space="0" w:color="000000"/>
-                      <w:left w:val="single" w:sz="8" w:space="0" w:color="000000"/>
-                      <w:bottom w:val="single" w:sz="8" w:space="0" w:color="000000"/>
-                      <w:right w:val="single" w:sz="8" w:space="0" w:color="000000"/>
-                      <w:insideH w:val="single" w:sz="8" w:space="0" w:color="000000"/>
-                      <w:insideV w:val="single" w:sz="8" w:space="0" w:color="000000"/>
-                    </w:tblBorders>
-                    <w:tblLayout w:type="fixed"/>
-                    <w:tblLook w:val="0600" w:firstRow="0" w:lastRow="0" w:firstColumn="0" w:lastColumn="0" w:noHBand="1" w:noVBand="1"/>
-                  </w:tblPr>
-                  <w:tblGrid>
-                    <w:gridCol w:w="6505"/>
-                  </w:tblGrid>
-                  <w:tr>
-                    <w:tc>
-                      <w:tcPr>
-                        <w:tcW w:w="6505" w:type="dxa"/>
-                        <w:shd w:val="clear" w:color="auto" w:fill="auto"/>
-                        <w:tcMar>
-                          <w:top w:w="100" w:type="dxa"/>
-                          <w:left w:w="100" w:type="dxa"/>
-                          <w:bottom w:w="100" w:type="dxa"/>
-                          <w:right w:w="100" w:type="dxa"/>
-                        </w:tcMar>
-                      </w:tcPr>
-                      <w:p>
-                        <w:pPr>
-                          <w:framePr w:hSpace="180" w:wrap="around" w:vAnchor="text" w:hAnchor="margin" w:xAlign="center" w:y="21"/>
-                          <w:widowControl w:val="0"/>
-                          <w:pBdr>
-                            <w:top w:val="nil"/>
-                            <w:left w:val="nil"/>
-                            <w:bottom w:val="nil"/>
-                            <w:right w:val="nil"/>
-                            <w:between w:val="nil"/>
-                          </w:pBdr>
-                          <w:spacing w:line="240" w:lineRule="auto"/>
-                        </w:pPr>
-                        <w:r>
-                          <w:t>Personal Training Char</w:t>
-                        </w:r>
-                        <w:r>
-                          <w:t xml:space="preserve">ges -   </w:t>
-                        </w:r>
-                      </w:p>
-                    </w:tc>
-                  </w:tr>
-                </w:tbl>
                 <w:p>
                   <w:pPr>
                     <w:framePr w:hSpace="180" w:wrap="around" w:vAnchor="text" w:hAnchor="margin" w:xAlign="center" w:y="21"/>
                     <w:widowControl w:val="0"/>
                     <w:spacing w:line="240" w:lineRule="auto"/>
-                  </w:pPr>
-                </w:p>
-                <w:tbl>
-                  <w:tblPr>
-                    <w:tblStyle w:val="a7"/>
-                    <w:tblW w:w="6505" w:type="dxa"/>
-                    <w:tblInd w:w="0" w:type="dxa"/>
-                    <w:tblBorders>
-                      <w:top w:val="single" w:sz="8" w:space="0" w:color="000000"/>
-                      <w:left w:val="single" w:sz="8" w:space="0" w:color="000000"/>
-                      <w:bottom w:val="single" w:sz="8" w:space="0" w:color="000000"/>
-                      <w:right w:val="single" w:sz="8" w:space="0" w:color="000000"/>
-                      <w:insideH w:val="single" w:sz="8" w:space="0" w:color="000000"/>
-                      <w:insideV w:val="single" w:sz="8" w:space="0" w:color="000000"/>
-                    </w:tblBorders>
-                    <w:tblLayout w:type="fixed"/>
-                    <w:tblLook w:val="0600" w:firstRow="0" w:lastRow="0" w:firstColumn="0" w:lastColumn="0" w:noHBand="1" w:noVBand="1"/>
-                  </w:tblPr>
-                  <w:tblGrid>
-                    <w:gridCol w:w="6505"/>
-                  </w:tblGrid>
-                  <w:tr>
-                    <w:tc>
-                      <w:tcPr>
-                        <w:tcW w:w="6505" w:type="dxa"/>
-                        <w:shd w:val="clear" w:color="auto" w:fill="auto"/>
-                        <w:tcMar>
-                          <w:top w:w="100" w:type="dxa"/>
-                          <w:left w:w="100" w:type="dxa"/>
-                          <w:bottom w:w="100" w:type="dxa"/>
-                          <w:right w:w="100" w:type="dxa"/>
-                        </w:tcMar>
-                      </w:tcPr>
-                      <w:p>
-                        <w:pPr>
-                          <w:framePr w:hSpace="180" w:wrap="around" w:vAnchor="text" w:hAnchor="margin" w:xAlign="center" w:y="21"/>
-                          <w:widowControl w:val="0"/>
-                          <w:pBdr>
-                            <w:top w:val="nil"/>
-                            <w:left w:val="nil"/>
-                            <w:bottom w:val="nil"/>
-                            <w:right w:val="nil"/>
-                            <w:between w:val="nil"/>
-                          </w:pBdr>
-                          <w:spacing w:line="240" w:lineRule="auto"/>
-                        </w:pPr>
-                        <w:r>
-                          <w:t>Total PT Payment -</w:t>
-                        </w:r>
-                        <w:r>
-                          <w:br/>
-                          <w:t xml:space="preserve">Start Date - </w:t>
-                        </w:r>
-                        <w:r>
-                          <w:rPr>
-                            <w:rFonts w:ascii="Courier New" w:hAnsi="Courier New" w:cs="Courier New"/>
-                            <w:color w:val="D7BA7D"/>
-                            <w:sz w:val="19"/>
-                            <w:szCs w:val="19"/>
-                          </w:rPr>
-                          <w:t>{</w:t>
-                        </w:r>
-                        <w:proofErr w:type="spellStart"/>
-                        <w:r>
-                          <w:rPr>
-                            <w:rFonts w:ascii="Courier New" w:hAnsi="Courier New" w:cs="Courier New"/>
-                            <w:color w:val="D7BA7D"/>
-                            <w:sz w:val="19"/>
-                            <w:szCs w:val="19"/>
-                          </w:rPr>
-                          <w:t>startDate</w:t>
-                        </w:r>
-                        <w:proofErr w:type="spellEnd"/>
-                        <w:r>
-                          <w:rPr>
-                            <w:rFonts w:ascii="Courier New" w:hAnsi="Courier New" w:cs="Courier New"/>
-                            <w:color w:val="D7BA7D"/>
-                            <w:sz w:val="19"/>
-                            <w:szCs w:val="19"/>
-                          </w:rPr>
-                          <w:t>}</w:t>
-                        </w:r>
-                        <w:r>
-                          <w:t xml:space="preserve"> </w:t>
-                        </w:r>
-                        <w:r>
-                          <w:br/>
-                          <w:t>End Date:</w:t>
-                        </w:r>
-                        <w:r>
-                          <w:rPr>
-                            <w:rFonts w:ascii="Courier New" w:hAnsi="Courier New" w:cs="Courier New"/>
-                            <w:color w:val="D7BA7D"/>
-                            <w:sz w:val="19"/>
-                            <w:szCs w:val="19"/>
-                          </w:rPr>
-                          <w:t xml:space="preserve"> {</w:t>
-                        </w:r>
-                        <w:proofErr w:type="spellStart"/>
-                        <w:r>
-                          <w:rPr>
-                            <w:rFonts w:ascii="Courier New" w:hAnsi="Courier New" w:cs="Courier New"/>
-                            <w:color w:val="D7BA7D"/>
-                            <w:sz w:val="19"/>
-                            <w:szCs w:val="19"/>
-                          </w:rPr>
-                          <w:t>endDate</w:t>
-                        </w:r>
-                        <w:proofErr w:type="spellEnd"/>
-                        <w:r>
-                          <w:rPr>
-                            <w:rFonts w:ascii="Courier New" w:hAnsi="Courier New" w:cs="Courier New"/>
-                            <w:color w:val="D7BA7D"/>
-                            <w:sz w:val="19"/>
-                            <w:szCs w:val="19"/>
-                          </w:rPr>
-                          <w:t>}</w:t>
-                        </w:r>
-                      </w:p>
-                    </w:tc>
-                  </w:tr>
-                </w:tbl>
-                <w:p>
-                  <w:pPr>
-                    <w:framePr w:hSpace="180" w:wrap="around" w:vAnchor="text" w:hAnchor="margin" w:xAlign="center" w:y="21"/>
-                    <w:widowControl w:val="0"/>
-                    <w:spacing w:line="240" w:lineRule="auto"/>
+                    <w:rPr>
+                      <w:color w:val="000000" w:themeColor="text1"/>
+                    </w:rPr>
                   </w:pPr>
                 </w:p>
                 <w:tbl>
@@ -1392,14 +1210,20 @@
                             <w:between w:val="nil"/>
                           </w:pBdr>
                           <w:spacing w:line="240" w:lineRule="auto"/>
+                          <w:rPr>
+                            <w:color w:val="000000" w:themeColor="text1"/>
+                          </w:rPr>
                         </w:pPr>
                         <w:r>
+                          <w:rPr>
+                            <w:color w:val="000000" w:themeColor="text1"/>
+                          </w:rPr>
                           <w:t xml:space="preserve">Total Amount - </w:t>
                         </w:r>
                         <w:r>
                           <w:rPr>
                             <w:rFonts w:ascii="Courier New" w:hAnsi="Courier New" w:cs="Courier New"/>
-                            <w:color w:val="D7BA7D"/>
+                            <w:color w:val="000000" w:themeColor="text1"/>
                             <w:sz w:val="19"/>
                             <w:szCs w:val="19"/>
                           </w:rPr>
@@ -1409,7 +1233,7 @@
                         <w:r>
                           <w:rPr>
                             <w:rFonts w:ascii="Courier New" w:hAnsi="Courier New" w:cs="Courier New"/>
-                            <w:color w:val="D7BA7D"/>
+                            <w:color w:val="000000" w:themeColor="text1"/>
                             <w:sz w:val="19"/>
                             <w:szCs w:val="19"/>
                           </w:rPr>
@@ -1419,29 +1243,76 @@
                         <w:r>
                           <w:rPr>
                             <w:rFonts w:ascii="Courier New" w:hAnsi="Courier New" w:cs="Courier New"/>
-                            <w:color w:val="D7BA7D"/>
+                            <w:color w:val="000000" w:themeColor="text1"/>
                             <w:sz w:val="19"/>
                             <w:szCs w:val="19"/>
                           </w:rPr>
                           <w:t>}</w:t>
                         </w:r>
                         <w:r>
+                          <w:rPr>
+                            <w:color w:val="000000" w:themeColor="text1"/>
+                          </w:rPr>
                           <w:t xml:space="preserve"> </w:t>
                         </w:r>
                         <w:r>
-                          <w:t xml:space="preserve"> Payment Mode - </w:t>
+                          <w:rPr>
+                            <w:color w:val="000000" w:themeColor="text1"/>
+                          </w:rPr>
+                          <w:t xml:space="preserve"> </w:t>
+                        </w:r>
+                      </w:p>
+                      <w:p>
+                        <w:pPr>
+                          <w:framePr w:hSpace="180" w:wrap="around" w:vAnchor="text" w:hAnchor="margin" w:xAlign="center" w:y="21"/>
+                          <w:widowControl w:val="0"/>
+                          <w:pBdr>
+                            <w:top w:val="nil"/>
+                            <w:left w:val="nil"/>
+                            <w:bottom w:val="nil"/>
+                            <w:right w:val="nil"/>
+                            <w:between w:val="nil"/>
+                          </w:pBdr>
+                          <w:spacing w:line="240" w:lineRule="auto"/>
+                          <w:rPr>
+                            <w:color w:val="000000" w:themeColor="text1"/>
+                          </w:rPr>
+                        </w:pPr>
+                        <w:r>
+                          <w:rPr>
+                            <w:color w:val="000000" w:themeColor="text1"/>
+                          </w:rPr>
+                          <w:t xml:space="preserve">Payment Mode - </w:t>
                         </w:r>
                         <w:r>
                           <w:rPr>
                             <w:rFonts w:ascii="Courier New" w:hAnsi="Courier New" w:cs="Courier New"/>
-                            <w:color w:val="D7BA7D"/>
+                            <w:color w:val="000000" w:themeColor="text1"/>
                             <w:sz w:val="19"/>
                             <w:szCs w:val="19"/>
                           </w:rPr>
-                          <w:t>{paymentMode}</w:t>
+                          <w:t>{</w:t>
                         </w:r>
-                        <w:bookmarkStart w:id="0" w:name="_GoBack"/>
-                        <w:bookmarkEnd w:id="0"/>
+                        <w:proofErr w:type="spellStart"/>
+                        <w:r>
+                          <w:rPr>
+                            <w:rFonts w:ascii="Courier New" w:hAnsi="Courier New" w:cs="Courier New"/>
+                            <w:color w:val="000000" w:themeColor="text1"/>
+                            <w:sz w:val="19"/>
+                            <w:szCs w:val="19"/>
+                          </w:rPr>
+                          <w:t>paymentMode</w:t>
+                        </w:r>
+                        <w:proofErr w:type="spellEnd"/>
+                        <w:r>
+                          <w:rPr>
+                            <w:rFonts w:ascii="Courier New" w:hAnsi="Courier New" w:cs="Courier New"/>
+                            <w:color w:val="000000" w:themeColor="text1"/>
+                            <w:sz w:val="19"/>
+                            <w:szCs w:val="19"/>
+                          </w:rPr>
+                          <w:t>}</w:t>
+                        </w:r>
                       </w:p>
                     </w:tc>
                   </w:tr>
@@ -1451,6 +1322,9 @@
                     <w:framePr w:hSpace="180" w:wrap="around" w:vAnchor="text" w:hAnchor="margin" w:xAlign="center" w:y="21"/>
                     <w:widowControl w:val="0"/>
                     <w:spacing w:line="240" w:lineRule="auto"/>
+                    <w:rPr>
+                      <w:color w:val="000000" w:themeColor="text1"/>
+                    </w:rPr>
                   </w:pPr>
                 </w:p>
                 <w:tbl>
@@ -1496,17 +1370,20 @@
                             <w:between w:val="nil"/>
                           </w:pBdr>
                           <w:spacing w:line="240" w:lineRule="auto"/>
+                          <w:rPr>
+                            <w:color w:val="000000" w:themeColor="text1"/>
+                          </w:rPr>
                         </w:pPr>
                         <w:r>
-                          <w:t>Package Detail</w:t>
-                        </w:r>
-                        <w:r>
-                          <w:t xml:space="preserve"> - </w:t>
+                          <w:rPr>
+                            <w:color w:val="000000" w:themeColor="text1"/>
+                          </w:rPr>
+                          <w:t xml:space="preserve">Package Detail - </w:t>
                         </w:r>
                         <w:r>
                           <w:rPr>
                             <w:rFonts w:ascii="Courier New" w:hAnsi="Courier New" w:cs="Courier New"/>
-                            <w:color w:val="D7BA7D"/>
+                            <w:color w:val="000000" w:themeColor="text1"/>
                             <w:sz w:val="19"/>
                             <w:szCs w:val="19"/>
                           </w:rPr>
@@ -1516,7 +1393,7 @@
                         <w:r>
                           <w:rPr>
                             <w:rFonts w:ascii="Courier New" w:hAnsi="Courier New" w:cs="Courier New"/>
-                            <w:color w:val="D7BA7D"/>
+                            <w:color w:val="000000" w:themeColor="text1"/>
                             <w:sz w:val="19"/>
                             <w:szCs w:val="19"/>
                           </w:rPr>
@@ -1526,7 +1403,7 @@
                         <w:r>
                           <w:rPr>
                             <w:rFonts w:ascii="Courier New" w:hAnsi="Courier New" w:cs="Courier New"/>
-                            <w:color w:val="D7BA7D"/>
+                            <w:color w:val="000000" w:themeColor="text1"/>
                             <w:sz w:val="19"/>
                             <w:szCs w:val="19"/>
                           </w:rPr>
@@ -1541,6 +1418,9 @@
                     <w:framePr w:hSpace="180" w:wrap="around" w:vAnchor="text" w:hAnchor="margin" w:xAlign="center" w:y="21"/>
                     <w:widowControl w:val="0"/>
                     <w:spacing w:line="240" w:lineRule="auto"/>
+                    <w:rPr>
+                      <w:color w:val="000000" w:themeColor="text1"/>
+                    </w:rPr>
                   </w:pPr>
                 </w:p>
               </w:tc>
@@ -1551,6 +1431,7 @@
               <w:widowControl w:val="0"/>
               <w:spacing w:line="240" w:lineRule="auto"/>
               <w:rPr>
+                <w:color w:val="000000" w:themeColor="text1"/>
                 <w:sz w:val="17"/>
                 <w:szCs w:val="17"/>
                 <w:highlight w:val="white"/>
@@ -1562,6 +1443,7 @@
               <w:widowControl w:val="0"/>
               <w:spacing w:line="240" w:lineRule="auto"/>
               <w:rPr>
+                <w:color w:val="000000" w:themeColor="text1"/>
                 <w:sz w:val="21"/>
                 <w:szCs w:val="21"/>
                 <w:highlight w:val="white"/>
@@ -1569,6 +1451,7 @@
             </w:pPr>
             <w:r>
               <w:rPr>
+                <w:color w:val="000000" w:themeColor="text1"/>
                 <w:sz w:val="21"/>
                 <w:szCs w:val="21"/>
                 <w:highlight w:val="white"/>
@@ -1581,6 +1464,7 @@
               <w:widowControl w:val="0"/>
               <w:spacing w:line="240" w:lineRule="auto"/>
               <w:rPr>
+                <w:color w:val="000000" w:themeColor="text1"/>
                 <w:sz w:val="17"/>
                 <w:szCs w:val="17"/>
                 <w:highlight w:val="white"/>
@@ -1588,6 +1472,7 @@
             </w:pPr>
             <w:r>
               <w:rPr>
+                <w:color w:val="000000" w:themeColor="text1"/>
                 <w:sz w:val="17"/>
                 <w:szCs w:val="17"/>
                 <w:highlight w:val="white"/>
@@ -1600,6 +1485,7 @@
               <w:widowControl w:val="0"/>
               <w:spacing w:line="240" w:lineRule="auto"/>
               <w:rPr>
+                <w:color w:val="000000" w:themeColor="text1"/>
                 <w:sz w:val="17"/>
                 <w:szCs w:val="17"/>
                 <w:highlight w:val="white"/>
@@ -1607,6 +1493,7 @@
             </w:pPr>
             <w:r>
               <w:rPr>
+                <w:color w:val="000000" w:themeColor="text1"/>
                 <w:sz w:val="17"/>
                 <w:szCs w:val="17"/>
                 <w:highlight w:val="white"/>
@@ -1619,6 +1506,7 @@
               <w:widowControl w:val="0"/>
               <w:spacing w:line="240" w:lineRule="auto"/>
               <w:rPr>
+                <w:color w:val="000000" w:themeColor="text1"/>
                 <w:sz w:val="17"/>
                 <w:szCs w:val="17"/>
                 <w:highlight w:val="white"/>
@@ -1626,6 +1514,7 @@
             </w:pPr>
             <w:r>
               <w:rPr>
+                <w:color w:val="000000" w:themeColor="text1"/>
                 <w:sz w:val="17"/>
                 <w:szCs w:val="17"/>
                 <w:highlight w:val="white"/>
@@ -1638,6 +1527,7 @@
               <w:widowControl w:val="0"/>
               <w:spacing w:line="240" w:lineRule="auto"/>
               <w:rPr>
+                <w:color w:val="000000" w:themeColor="text1"/>
                 <w:sz w:val="17"/>
                 <w:szCs w:val="17"/>
                 <w:highlight w:val="white"/>
@@ -1645,6 +1535,7 @@
             </w:pPr>
             <w:r>
               <w:rPr>
+                <w:color w:val="000000" w:themeColor="text1"/>
                 <w:sz w:val="17"/>
                 <w:szCs w:val="17"/>
                 <w:highlight w:val="white"/>
@@ -1657,6 +1548,7 @@
               <w:widowControl w:val="0"/>
               <w:spacing w:line="240" w:lineRule="auto"/>
               <w:rPr>
+                <w:color w:val="000000" w:themeColor="text1"/>
                 <w:sz w:val="17"/>
                 <w:szCs w:val="17"/>
                 <w:highlight w:val="white"/>
@@ -1664,6 +1556,7 @@
             </w:pPr>
             <w:r>
               <w:rPr>
+                <w:color w:val="000000" w:themeColor="text1"/>
                 <w:sz w:val="17"/>
                 <w:szCs w:val="17"/>
                 <w:highlight w:val="white"/>
@@ -1676,6 +1569,7 @@
               <w:widowControl w:val="0"/>
               <w:spacing w:line="240" w:lineRule="auto"/>
               <w:rPr>
+                <w:color w:val="000000" w:themeColor="text1"/>
                 <w:sz w:val="17"/>
                 <w:szCs w:val="17"/>
                 <w:highlight w:val="white"/>
@@ -1683,6 +1577,7 @@
             </w:pPr>
             <w:r>
               <w:rPr>
+                <w:color w:val="000000" w:themeColor="text1"/>
                 <w:sz w:val="17"/>
                 <w:szCs w:val="17"/>
                 <w:highlight w:val="white"/>
@@ -1695,6 +1590,7 @@
               <w:widowControl w:val="0"/>
               <w:spacing w:line="240" w:lineRule="auto"/>
               <w:rPr>
+                <w:color w:val="000000" w:themeColor="text1"/>
                 <w:sz w:val="17"/>
                 <w:szCs w:val="17"/>
                 <w:highlight w:val="white"/>
@@ -1702,6 +1598,7 @@
             </w:pPr>
             <w:r>
               <w:rPr>
+                <w:color w:val="000000" w:themeColor="text1"/>
                 <w:sz w:val="17"/>
                 <w:szCs w:val="17"/>
                 <w:highlight w:val="white"/>
@@ -1711,6 +1608,7 @@
             <w:proofErr w:type="spellStart"/>
             <w:r>
               <w:rPr>
+                <w:color w:val="000000" w:themeColor="text1"/>
                 <w:sz w:val="17"/>
                 <w:szCs w:val="17"/>
                 <w:highlight w:val="white"/>
@@ -1720,6 +1618,7 @@
             <w:proofErr w:type="spellEnd"/>
             <w:r>
               <w:rPr>
+                <w:color w:val="000000" w:themeColor="text1"/>
                 <w:sz w:val="17"/>
                 <w:szCs w:val="17"/>
                 <w:highlight w:val="white"/>
@@ -1739,6 +1638,7 @@
               </w:pBdr>
               <w:spacing w:line="240" w:lineRule="auto"/>
               <w:rPr>
+                <w:color w:val="000000" w:themeColor="text1"/>
                 <w:sz w:val="17"/>
                 <w:szCs w:val="17"/>
                 <w:highlight w:val="white"/>
@@ -1746,6 +1646,7 @@
             </w:pPr>
             <w:r>
               <w:rPr>
+                <w:color w:val="000000" w:themeColor="text1"/>
                 <w:sz w:val="17"/>
                 <w:szCs w:val="17"/>
                 <w:highlight w:val="white"/>
@@ -1756,8 +1657,20 @@
         </w:tc>
       </w:tr>
     </w:tbl>
-    <w:p/>
-    <w:p/>
+    <w:p>
+      <w:pPr>
+        <w:rPr>
+          <w:color w:val="000000" w:themeColor="text1"/>
+        </w:rPr>
+      </w:pPr>
+    </w:p>
+    <w:p>
+      <w:pPr>
+        <w:rPr>
+          <w:color w:val="000000" w:themeColor="text1"/>
+        </w:rPr>
+      </w:pPr>
+    </w:p>
     <w:sectPr>
       <w:pgSz w:w="12240" w:h="15840"/>
       <w:pgMar w:top="1440" w:right="1440" w:bottom="1440" w:left="1440" w:header="720" w:footer="720" w:gutter="0"/>

</xml_diff>